<commit_message>
feat: Refactor batch generation to hours-based and add real-time streaming
Major changes:
- Replace week-based batch generation with hours/lesson-based calculation
- Add SSE streaming endpoint for real-time generation progress updates
- Implement template version history system with restore/compare features
- Add JSON extraction utility for AI-generated content
- Update database schema to support hours-based workflow
- Add FieldMappingPanel component and update frontend stores
- Add template HTML export functionality
- Enhance security with sandboxed Jinja2 environment
- Update .gitignore to track template DOCX files

🤖 Generated with [Claude Code](https://claude.com/claude-code)

Co-Authored-By: Claude <noreply@anthropic.com>
</commit_message>
<xml_diff>
--- a/storage/templates/yunnan_forestry_college_template.docx
+++ b/storage/templates/yunnan_forestry_college_template.docx
@@ -77,14 +77,9 @@
             <w:tcW w:w="2684" w:type="dxa"/>
           </w:tcPr>
           <w:p>
-            <w:pPr>
-              <w:spacing w:after="0" w:line="240" w:lineRule="auto"/>
-            </w:pPr>
             <w:r>
-              <w:t>1</w:t>
+              <w:t>{{lesson_number}}</w:t>
             </w:r>
-            <w:bookmarkStart w:id="0" w:name="_GoBack"/>
-            <w:bookmarkEnd w:id="0"/>
           </w:p>
         </w:tc>
         <w:tc>

</xml_diff>